<commit_message>
Highlight partner policy operating principles
</commit_message>
<xml_diff>
--- a/downloads/HarmonyLink_Partner_Policy_v1.0.docx
+++ b/downloads/HarmonyLink_Partner_Policy_v1.0.docx
@@ -3515,7 +3515,11 @@
         </w:tc>
       </w:tr>
     </w:tbl>
-    <w:p/>
+    <w:p>
+      <w:r>
+        <w:br w:type="page"/>
+      </w:r>
+    </w:p>
     <w:tbl>
       <w:tblPr>
         <w:tblW w:type="auto" w:w="0"/>
@@ -3532,45 +3536,57 @@
             <w:tcW w:type="dxa" w:w="9878"/>
             <w:shd w:fill="082C68"/>
             <w:tcMar>
-              <w:top w:w="150" w:type="dxa"/>
-              <w:start w:w="170" w:type="dxa"/>
-              <w:bottom w:w="150" w:type="dxa"/>
-              <w:end w:w="170" w:type="dxa"/>
+              <w:top w:w="420" w:type="dxa"/>
+              <w:start w:w="420" w:type="dxa"/>
+              <w:bottom w:w="420" w:type="dxa"/>
+              <w:end w:w="420" w:type="dxa"/>
             </w:tcMar>
           </w:tcPr>
           <w:p>
             <w:pPr>
-              <w:spacing w:after="80"/>
+              <w:spacing w:after="360"/>
+              <w:jc w:val="center"/>
             </w:pPr>
             <w:r>
               <w:rPr>
                 <w:b/>
                 <w:color w:val="FFFFFF"/>
-                <w:sz w:val="20"/>
+                <w:sz w:val="44"/>
               </w:rPr>
               <w:t>운영 원칙</w:t>
             </w:r>
           </w:p>
           <w:p>
             <w:pPr>
-              <w:spacing w:after="0" w:line="283" w:lineRule="auto"/>
+              <w:spacing w:after="260" w:line="324" w:lineRule="auto"/>
+              <w:jc w:val="center"/>
             </w:pPr>
             <w:r>
               <w:rPr>
-                <w:color w:val="10213B"/>
-                <w:sz w:val="19"/>
+                <w:b/>
+                <w:color w:val="FFFFFF"/>
+                <w:sz w:val="28"/>
               </w:rPr>
-              <w:t>HarmonyLink는 강사와 교육기관이 함께 성장하는 신뢰 기반의 교육 플랫폼을 지향합니다. 공정한 매칭, 투명한 운영, 상호 존중을 바탕으로 지속 가능한 교육 생태계를 만들어 갑니다.</w:t>
+              <w:t>Harmony Link는 강사와 교육기관이 함께 성장하는 신뢰 기반의 교육 플랫폼을 지향합니다.</w:t>
+            </w:r>
+          </w:p>
+          <w:p>
+            <w:pPr>
+              <w:spacing w:after="260" w:line="324" w:lineRule="auto"/>
+              <w:jc w:val="center"/>
+            </w:pPr>
+            <w:r>
+              <w:rPr>
+                <w:b/>
+                <w:color w:val="FFFFFF"/>
+                <w:sz w:val="28"/>
+              </w:rPr>
+              <w:t>공정한 매칭, 투명한 운영, 상호 존중을 바탕으로 지속 가능한 교육 생태계를 만들어 갑니다.</w:t>
             </w:r>
           </w:p>
         </w:tc>
       </w:tr>
     </w:tbl>
-    <w:p>
-      <w:pPr>
-        <w:spacing w:after="0"/>
-      </w:pPr>
-    </w:p>
     <w:sectPr>
       <w:headerReference w:type="default" r:id="rId9"/>
       <w:footerReference w:type="default" r:id="rId10"/>

</xml_diff>